<commit_message>
Lab4 report: use live page screenshots
</commit_message>
<xml_diff>
--- a/lab4/Otchet_Lab4_Web-Dizayn.docx
+++ b/lab4/Otchet_Lab4_Web-Dizayn.docx
@@ -742,7 +742,7 @@
           <w:i/>
           <w:sz w:val="24"/>
         </w:rPr>
-        <w:t>Тема Fashion</w:t>
+        <w:t>Главная</w:t>
       </w:r>
     </w:p>
     <w:p>
@@ -752,7 +752,7 @@
       <w:r>
         <w:drawing>
           <wp:inline xmlns:a="http://schemas.openxmlformats.org/drawingml/2006/main" xmlns:pic="http://schemas.openxmlformats.org/drawingml/2006/picture">
-            <wp:extent cx="5212080" cy="4076775"/>
+            <wp:extent cx="5212080" cy="2671191"/>
             <wp:docPr id="1" name="Picture 1"/>
             <wp:cNvGraphicFramePr>
               <a:graphicFrameLocks noChangeAspect="1"/>
@@ -761,7 +761,7 @@
               <a:graphicData uri="http://schemas.openxmlformats.org/drawingml/2006/picture">
                 <pic:pic>
                   <pic:nvPicPr>
-                    <pic:cNvPr id="0" name="fashion.jpg"/>
+                    <pic:cNvPr id="0" name="01_home.png"/>
                     <pic:cNvPicPr/>
                   </pic:nvPicPr>
                   <pic:blipFill>
@@ -773,7 +773,7 @@
                   <pic:spPr>
                     <a:xfrm>
                       <a:off x="0" y="0"/>
-                      <a:ext cx="5212080" cy="4076775"/>
+                      <a:ext cx="5212080" cy="2671191"/>
                     </a:xfrm>
                     <a:prstGeom prst="rect"/>
                   </pic:spPr>
@@ -810,7 +810,7 @@
           <w:i/>
           <w:sz w:val="24"/>
         </w:rPr>
-        <w:t>Тема Folio</w:t>
+        <w:t>Услуги</w:t>
       </w:r>
     </w:p>
     <w:p>
@@ -820,7 +820,7 @@
       <w:r>
         <w:drawing>
           <wp:inline xmlns:a="http://schemas.openxmlformats.org/drawingml/2006/main" xmlns:pic="http://schemas.openxmlformats.org/drawingml/2006/picture">
-            <wp:extent cx="5212080" cy="9265920"/>
+            <wp:extent cx="5212080" cy="2671191"/>
             <wp:docPr id="2" name="Picture 2"/>
             <wp:cNvGraphicFramePr>
               <a:graphicFrameLocks noChangeAspect="1"/>
@@ -829,7 +829,7 @@
               <a:graphicData uri="http://schemas.openxmlformats.org/drawingml/2006/picture">
                 <pic:pic>
                   <pic:nvPicPr>
-                    <pic:cNvPr id="0" name="folio.jpg"/>
+                    <pic:cNvPr id="0" name="02_services.png"/>
                     <pic:cNvPicPr/>
                   </pic:nvPicPr>
                   <pic:blipFill>
@@ -841,7 +841,7 @@
                   <pic:spPr>
                     <a:xfrm>
                       <a:off x="0" y="0"/>
-                      <a:ext cx="5212080" cy="9265920"/>
+                      <a:ext cx="5212080" cy="2671191"/>
                     </a:xfrm>
                     <a:prstGeom prst="rect"/>
                   </pic:spPr>
@@ -878,7 +878,7 @@
           <w:i/>
           <w:sz w:val="24"/>
         </w:rPr>
-        <w:t>Досье / референс</w:t>
+        <w:t>Дизайны</w:t>
       </w:r>
     </w:p>
     <w:p>
@@ -888,7 +888,7 @@
       <w:r>
         <w:drawing>
           <wp:inline xmlns:a="http://schemas.openxmlformats.org/drawingml/2006/main" xmlns:pic="http://schemas.openxmlformats.org/drawingml/2006/picture">
-            <wp:extent cx="5212080" cy="7081630"/>
+            <wp:extent cx="5212080" cy="2671191"/>
             <wp:docPr id="3" name="Picture 3"/>
             <wp:cNvGraphicFramePr>
               <a:graphicFrameLocks noChangeAspect="1"/>
@@ -897,7 +897,7 @@
               <a:graphicData uri="http://schemas.openxmlformats.org/drawingml/2006/picture">
                 <pic:pic>
                   <pic:nvPicPr>
-                    <pic:cNvPr id="0" name="dossier.jpg"/>
+                    <pic:cNvPr id="0" name="03_designs.png"/>
                     <pic:cNvPicPr/>
                   </pic:nvPicPr>
                   <pic:blipFill>
@@ -909,7 +909,7 @@
                   <pic:spPr>
                     <a:xfrm>
                       <a:off x="0" y="0"/>
-                      <a:ext cx="5212080" cy="7081630"/>
+                      <a:ext cx="5212080" cy="2671191"/>
                     </a:xfrm>
                     <a:prstGeom prst="rect"/>
                   </pic:spPr>
@@ -946,7 +946,7 @@
           <w:i/>
           <w:sz w:val="24"/>
         </w:rPr>
-        <w:t>Персонаж аниме</w:t>
+        <w:t>Контакты</w:t>
       </w:r>
     </w:p>
     <w:p>
@@ -956,7 +956,7 @@
       <w:r>
         <w:drawing>
           <wp:inline xmlns:a="http://schemas.openxmlformats.org/drawingml/2006/main" xmlns:pic="http://schemas.openxmlformats.org/drawingml/2006/picture">
-            <wp:extent cx="5212080" cy="10263978"/>
+            <wp:extent cx="5212080" cy="2671191"/>
             <wp:docPr id="4" name="Picture 4"/>
             <wp:cNvGraphicFramePr>
               <a:graphicFrameLocks noChangeAspect="1"/>
@@ -965,7 +965,7 @@
               <a:graphicData uri="http://schemas.openxmlformats.org/drawingml/2006/picture">
                 <pic:pic>
                   <pic:nvPicPr>
-                    <pic:cNvPr id="0" name="anime-hero.png"/>
+                    <pic:cNvPr id="0" name="04_contacts.png"/>
                     <pic:cNvPicPr/>
                   </pic:nvPicPr>
                   <pic:blipFill>
@@ -977,143 +977,7 @@
                   <pic:spPr>
                     <a:xfrm>
                       <a:off x="0" y="0"/>
-                      <a:ext cx="5212080" cy="10263978"/>
-                    </a:xfrm>
-                    <a:prstGeom prst="rect"/>
-                  </pic:spPr>
-                </pic:pic>
-              </a:graphicData>
-            </a:graphic>
-          </wp:inline>
-        </w:drawing>
-      </w:r>
-    </w:p>
-    <w:p>
-      <w:pPr>
-        <w:spacing w:after="160" w:line="276" w:lineRule="auto"/>
-        <w:jc w:val="both"/>
-      </w:pPr>
-      <w:r>
-        <w:rPr>
-          <w:rFonts w:ascii="Times New Roman" w:hAnsi="Times New Roman" w:eastAsia="Times New Roman"/>
-          <w:b w:val="0"/>
-          <w:i w:val="0"/>
-          <w:sz w:val="28"/>
-        </w:rPr>
-      </w:r>
-    </w:p>
-    <w:p>
-      <w:pPr>
-        <w:spacing w:after="80" w:line="276" w:lineRule="auto"/>
-        <w:jc w:val="center"/>
-      </w:pPr>
-      <w:r>
-        <w:rPr>
-          <w:rFonts w:ascii="Times New Roman" w:hAnsi="Times New Roman" w:eastAsia="Times New Roman"/>
-          <w:b w:val="0"/>
-          <w:i/>
-          <w:sz w:val="24"/>
-        </w:rPr>
-        <w:t>Fashion-герой</w:t>
-      </w:r>
-    </w:p>
-    <w:p>
-      <w:pPr>
-        <w:jc w:val="center"/>
-      </w:pPr>
-      <w:r>
-        <w:drawing>
-          <wp:inline xmlns:a="http://schemas.openxmlformats.org/drawingml/2006/main" xmlns:pic="http://schemas.openxmlformats.org/drawingml/2006/picture">
-            <wp:extent cx="5212080" cy="17626307"/>
-            <wp:docPr id="5" name="Picture 5"/>
-            <wp:cNvGraphicFramePr>
-              <a:graphicFrameLocks noChangeAspect="1"/>
-            </wp:cNvGraphicFramePr>
-            <a:graphic>
-              <a:graphicData uri="http://schemas.openxmlformats.org/drawingml/2006/picture">
-                <pic:pic>
-                  <pic:nvPicPr>
-                    <pic:cNvPr id="0" name="fashion-hero.png"/>
-                    <pic:cNvPicPr/>
-                  </pic:nvPicPr>
-                  <pic:blipFill>
-                    <a:blip r:embed="rId13"/>
-                    <a:stretch>
-                      <a:fillRect/>
-                    </a:stretch>
-                  </pic:blipFill>
-                  <pic:spPr>
-                    <a:xfrm>
-                      <a:off x="0" y="0"/>
-                      <a:ext cx="5212080" cy="17626307"/>
-                    </a:xfrm>
-                    <a:prstGeom prst="rect"/>
-                  </pic:spPr>
-                </pic:pic>
-              </a:graphicData>
-            </a:graphic>
-          </wp:inline>
-        </w:drawing>
-      </w:r>
-    </w:p>
-    <w:p>
-      <w:pPr>
-        <w:spacing w:after="160" w:line="276" w:lineRule="auto"/>
-        <w:jc w:val="both"/>
-      </w:pPr>
-      <w:r>
-        <w:rPr>
-          <w:rFonts w:ascii="Times New Roman" w:hAnsi="Times New Roman" w:eastAsia="Times New Roman"/>
-          <w:b w:val="0"/>
-          <w:i w:val="0"/>
-          <w:sz w:val="28"/>
-        </w:rPr>
-      </w:r>
-    </w:p>
-    <w:p>
-      <w:pPr>
-        <w:spacing w:after="80" w:line="276" w:lineRule="auto"/>
-        <w:jc w:val="center"/>
-      </w:pPr>
-      <w:r>
-        <w:rPr>
-          <w:rFonts w:ascii="Times New Roman" w:hAnsi="Times New Roman" w:eastAsia="Times New Roman"/>
-          <w:b w:val="0"/>
-          <w:i/>
-          <w:sz w:val="24"/>
-        </w:rPr>
-        <w:t>Folio-герой</w:t>
-      </w:r>
-    </w:p>
-    <w:p>
-      <w:pPr>
-        <w:jc w:val="center"/>
-      </w:pPr>
-      <w:r>
-        <w:drawing>
-          <wp:inline xmlns:a="http://schemas.openxmlformats.org/drawingml/2006/main" xmlns:pic="http://schemas.openxmlformats.org/drawingml/2006/picture">
-            <wp:extent cx="5212080" cy="11898284"/>
-            <wp:docPr id="6" name="Picture 6"/>
-            <wp:cNvGraphicFramePr>
-              <a:graphicFrameLocks noChangeAspect="1"/>
-            </wp:cNvGraphicFramePr>
-            <a:graphic>
-              <a:graphicData uri="http://schemas.openxmlformats.org/drawingml/2006/picture">
-                <pic:pic>
-                  <pic:nvPicPr>
-                    <pic:cNvPr id="0" name="folio-hero.png"/>
-                    <pic:cNvPicPr/>
-                  </pic:nvPicPr>
-                  <pic:blipFill>
-                    <a:blip r:embed="rId14"/>
-                    <a:stretch>
-                      <a:fillRect/>
-                    </a:stretch>
-                  </pic:blipFill>
-                  <pic:spPr>
-                    <a:xfrm>
-                      <a:off x="0" y="0"/>
-                      <a:ext cx="5212080" cy="11898284"/>
+                      <a:ext cx="5212080" cy="2671191"/>
                     </a:xfrm>
                     <a:prstGeom prst="rect"/>
                   </pic:spPr>

</xml_diff>